<commit_message>
Menu links fit shorter screens; service worker refreshes in the background; published link in docs
</commit_message>
<xml_diff>
--- a/docs/Super Dog Adventure Guide.docx
+++ b/docs/Super Dog Adventure Guide.docx
@@ -19,10 +19,36 @@
           <w:rPr>
             <w:rStyle w:val="Hyperlink"/>
           </w:rPr>
+          <w:t>https://hellovlt.github.io/super-dog-island-adventure/</w:t>
+        </w:r>
+      </w:hyperlink>
+      <w:r/>
+    </w:p>
+    <w:p>
+      <w:r>
+        <w:t>Open that address on any computer or tablet. To keep it on the home screen, use the install icon in the address bar</w:t>
+      </w:r>
+    </w:p>
+    <w:p>
+      <w:r>
+        <w:t>(Chrome or Edge) or Share → Add to Home Screen (iPad). After that the game opens like an app and works without internet.</w:t>
+      </w:r>
+    </w:p>
+    <w:p>
+      <w:r>
+        <w:t xml:space="preserve">The game also runs from this computer at </w:t>
+      </w:r>
+      <w:hyperlink r:id="rId10">
+        <w:r>
+          <w:rPr>
+            <w:rStyle w:val="Hyperlink"/>
+          </w:rPr>
           <w:t>http://localhost:5173/</w:t>
         </w:r>
       </w:hyperlink>
-      <w:r/>
+      <w:r>
+        <w:t xml:space="preserve"> while the local server is running.</w:t>
+      </w:r>
     </w:p>
     <w:p>
       <w:r>
@@ -39,7 +65,7 @@
     </w:p>
     <w:p>
       <w:r>
-        <w:t>If the page does not open, open PowerShell in C:\Users\serbo\Coding\ART03 SuperDog and run npm start. Keep the terminal open. Node.js 18 or newer and a browser with WebGL 2 are required. Chrome and Edge are supported targets.</w:t>
+        <w:t>If the page does not open, open PowerShell in the game folder and run npm start. Keep the terminal open. Node.js 18 or newer and a browser with WebGL 2 are required. Chrome and Edge are supported targets.</w:t>
       </w:r>
     </w:p>
     <w:p>
@@ -347,7 +373,7 @@
       <w:r>
         <w:t xml:space="preserve">The earlier six-world platformer is available at </w:t>
       </w:r>
-      <w:hyperlink r:id="rId10">
+      <w:hyperlink r:id="rId11">
         <w:r>
           <w:rPr>
             <w:rStyle w:val="Hyperlink"/>

</xml_diff>

<commit_message>
feat(friends): play on the same island with up to eight friends, joined by a five-letter code
Devices connect directly to each other (Trystero over WebRTC, vendored, MIT); no
server and no account. Friends appear as their own dogs with capes, hats, fur
and name tags, smoothed between updates, and their barks are heard. Codes avoid
look-alike characters and accept sloppy typing; names come from a fixed list and
de-duplicate; a full island turns latecomers away. A drawing is shared only when
the player switches it on. The service worker no longer runs on localhost, where
it served yesterday's files during development.
</commit_message>
<xml_diff>
--- a/docs/Super Dog Adventure Guide.docx
+++ b/docs/Super Dog Adventure Guide.docx
@@ -141,6 +141,29 @@
         <w:pStyle w:val="Heading1"/>
       </w:pPr>
       <w:r>
+        <w:t>Playing with friends</w:t>
+      </w:r>
+    </w:p>
+    <w:p>
+      <w:r>
+        <w:t>Choose Play with friends in the main menu. One of you presses Start a game and reads out the five letters; everyone else types them into Join. Up to eight of you can run around the same island together, seeing each other's dogs, hats and barks.</w:t>
+      </w:r>
+    </w:p>
+    <w:p>
+      <w:r>
+        <w:t>Everyone still collects their own bones and rescues their own friends. Keep the code between friends: anyone who knows it can join. Your drawing stays private unless you switch on Show my drawing to friends.</w:t>
+      </w:r>
+    </w:p>
+    <w:p>
+      <w:r>
+        <w:t>If joining does not work, the two devices cannot reach each other directly; this happens on some school and mobile connections. Try the same wifi.</w:t>
+      </w:r>
+    </w:p>
+    <w:p>
+      <w:pPr>
+        <w:pStyle w:val="Heading1"/>
+      </w:pPr>
+      <w:r>
         <w:t>Guides, Bone Rush, and the wardrobe</w:t>
       </w:r>
     </w:p>
@@ -263,6 +286,14 @@
       </w:pPr>
       <w:r>
         <w:t>Talk to a guide: E.</w:t>
+      </w:r>
+    </w:p>
+    <w:p>
+      <w:pPr>
+        <w:pStyle w:val="ListBullet"/>
+      </w:pPr>
+      <w:r>
+        <w:t>Camera behind Super Dog: C (or the ◎ button).</w:t>
       </w:r>
     </w:p>
     <w:p>

</xml_diff>

<commit_message>
feat(stories): a story book of twenty tales, read aloud in a warm voice, with subtitles
Twenty short stories open as the adventure is played: one per world, one behind
each secret, one for each giant beaten. Every spoken line (stories, guides,
rescued friends, and the game's own prompts) is recorded ahead of time with
ElevenLabs and played from assets/voice/, so the published game needs no speech
service, no key, and no network; the browser voice remains the fallback.

Subtitles show the same words for players who cannot hear, and optionally
describe sounds such as Woof! or Checkpoint chime. A test fails if any spoken
text is edited without re-recording, so voice and screen can never disagree.
</commit_message>
<xml_diff>
--- a/docs/Super Dog Adventure Guide.docx
+++ b/docs/Super Dog Adventure Guide.docx
@@ -180,6 +180,34 @@
     <w:p>
       <w:r>
         <w:t>Bones buy new capes, hats, and fur colors in the Wardrobe on the main menu. Super Dog spins around so you can see each choice.</w:t>
+      </w:r>
+    </w:p>
+    <w:p>
+      <w:pPr>
+        <w:pStyle w:val="Heading1"/>
+      </w:pPr>
+      <w:r>
+        <w:t>Stories and subtitles</w:t>
+      </w:r>
+    </w:p>
+    <w:p>
+      <w:r>
+        <w:t>Open the Story book in the main menu. It fills up as you play: every world, every secret and every giant adds a</w:t>
+      </w:r>
+    </w:p>
+    <w:p>
+      <w:r>
+        <w:t>story. Press Read it to me and a friendly voice reads it aloud, with the words shown on screen at the same time.</w:t>
+      </w:r>
+    </w:p>
+    <w:p>
+      <w:r>
+        <w:t>If you cannot hear, turn on subtitles in Settings. Choose Speech to see what is said, or Speech + sounds to</w:t>
+      </w:r>
+    </w:p>
+    <w:p>
+      <w:r>
+        <w:t>also see short notes such as "Woof!" or "Checkpoint chime".</w:t>
       </w:r>
     </w:p>
     <w:p>

</xml_diff>